<commit_message>
feat(hop-dong): điền sẵn ngày hiệu lực {{ngay_bat_dau}} trong mẫu HĐLĐ/HĐTV
Câu "…có hiệu lực từ ngày" trong HĐLĐ BO, HĐLĐ KD, HĐTV BO, HĐTV KD tự điền
ngày bắt đầu hợp đồng khi xuất — không cần bổ sung tay.

Co-Authored-By: Claude Opus 5.5 <noreply@anthropic.com>
</commit_message>
<xml_diff>
--- a/public/templates/MAU_VIC_HDTV_KD.docx
+++ b/public/templates/MAU_VIC_HDTV_KD.docx
@@ -30,7 +30,7 @@
                 <w:noProof/>
               </w:rPr>
               <w:drawing>
-                <wp:inline distT="0" distB="0" distL="0" distR="0" wp14:anchorId="0ABB384D" wp14:editId="0629F544">
+                <wp:inline distT="0" distB="0" distL="0" distR="0" wp14:anchorId="0ABB384D" wp14:editId="4DA3853A">
                   <wp:extent cx="2057400" cy="597535"/>
                   <wp:effectExtent l="0" t="0" r="0" b="0"/>
                   <wp:docPr id="650076419" name="Picture 1"/>
@@ -3936,6 +3936,24 @@
           <w:lang w:val="fr-FR"/>
         </w:rPr>
         <w:t>Hợp đồng thử việc này được lập thành hai (02) bản có giá trị pháp lý như nhau và có hiệu lực từ ngày</w:t>
+      </w:r>
+      <w:r>
+        <w:rPr>
+          <w:rFonts w:ascii="Times New Roman" w:hAnsi="Times New Roman"/>
+          <w:sz w:val="24"/>
+          <w:szCs w:val="24"/>
+          <w:lang w:val="fr-FR"/>
+        </w:rPr>
+        <w:t xml:space="preserve"> </w:t>
+      </w:r>
+      <w:r>
+        <w:rPr>
+          <w:rFonts w:ascii="Times New Roman" w:hAnsi="Times New Roman"/>
+          <w:sz w:val="24"/>
+          <w:szCs w:val="24"/>
+          <w:lang w:val="pt-BR"/>
+        </w:rPr>
+        <w:t>{{ngay_bat_dau}}</w:t>
       </w:r>
     </w:p>
     <w:p>

</xml_diff>